<commit_message>
docs: muc 12 Linear vs Conv2d + sua nguong verify tu tuyet doi sang tuong doi
Do bang study/kiem_linear_vs_conv.py: lech tuong doi 3.6e-06 (30x eps), 0/10000 anh
doan khac nhau. Nguong 1e-4 tuyet doi khong dat duoc ke ca khi cong thuc dung.

Co-Authored-By: Claude Opus 5 <noreply@anthropic.com>
Claude-Session: https://claude.ai/code/session_01XDEwCyCYJk3UKpHYKnxnkU
</commit_message>
<xml_diff>
--- a/docs/buoc4-kien-thuc-lien-quan.docx
+++ b/docs/buoc4-kien-thuc-lien-quan.docx
@@ -268,7 +268,24 @@
           <w:sz w:val="22"/>
           <w:szCs w:val="22"/>
         </w:rPr>
-        <w:t xml:space="preserve">12. Tổng hợp lựa chọn</w:t>
+        <w:t xml:space="preserve">12. Linear là trường hợp đặc biệt của Conv2d</w:t>
+      </w:r>
+    </w:p>
+    <w:p>
+      <w:pPr>
+        <w:spacing w:after="60"/>
+        <w:ind w:left="0"/>
+      </w:pPr>
+      <w:r>
+        <w:rPr>
+          <w:rFonts w:ascii="Calibri" w:cs="Calibri" w:eastAsia="Calibri" w:hAnsi="Calibri"/>
+          <w:b/>
+          <w:bCs/>
+          <w:color w:val="0F2A44"/>
+          <w:sz w:val="22"/>
+          <w:szCs w:val="22"/>
+        </w:rPr>
+        <w:t xml:space="preserve">13. Tổng hợp lựa chọn</w:t>
       </w:r>
     </w:p>
     <w:p>
@@ -6507,7 +6524,1603 @@
         <w:pStyle w:val="Heading1"/>
       </w:pPr>
       <w:r>
-        <w:t xml:space="preserve">12. Tổng hợp lựa chọn</w:t>
+        <w:t xml:space="preserve">12. Linear là trường hợp đặc biệt của Conv2d</w:t>
+      </w:r>
+    </w:p>
+    <w:p>
+      <w:pPr>
+        <w:spacing w:after="120" w:before="0"/>
+      </w:pPr>
+      <w:r>
+        <w:rPr>
+          <w:rFonts w:ascii="Calibri" w:cs="Calibri" w:eastAsia="Calibri" w:hAnsi="Calibri"/>
+          <w:color w:val="1A2733"/>
+          <w:sz w:val="22"/>
+          <w:szCs w:val="22"/>
+        </w:rPr>
+        <w:t xml:space="preserve">Lớp cuối của SmallCNN là </w:t>
+      </w:r>
+      <w:r>
+        <w:rPr>
+          <w:rFonts w:ascii="Calibri" w:cs="Calibri" w:eastAsia="Calibri" w:hAnsi="Calibri"/>
+          <w:b/>
+          <w:bCs/>
+          <w:color w:val="1A2733"/>
+          <w:sz w:val="22"/>
+          <w:szCs w:val="22"/>
+        </w:rPr>
+        <w:t xml:space="preserve">Linear(144, 10)</w:t>
+      </w:r>
+      <w:r>
+        <w:rPr>
+          <w:rFonts w:ascii="Calibri" w:cs="Calibri" w:eastAsia="Calibri" w:hAnsi="Calibri"/>
+          <w:color w:val="1A2733"/>
+          <w:sz w:val="22"/>
+          <w:szCs w:val="22"/>
+        </w:rPr>
+        <w:t xml:space="preserve">. Nó viết lại được thành </w:t>
+      </w:r>
+      <w:r>
+        <w:rPr>
+          <w:rFonts w:ascii="Calibri" w:cs="Calibri" w:eastAsia="Calibri" w:hAnsi="Calibri"/>
+          <w:b/>
+          <w:bCs/>
+          <w:color w:val="1A2733"/>
+          <w:sz w:val="22"/>
+          <w:szCs w:val="22"/>
+        </w:rPr>
+        <w:t xml:space="preserve">Conv2d(16 → 10, kernel 3, padding 0)</w:t>
+      </w:r>
+      <w:r>
+        <w:rPr>
+          <w:rFonts w:ascii="Calibri" w:cs="Calibri" w:eastAsia="Calibri" w:hAnsi="Calibri"/>
+          <w:color w:val="1A2733"/>
+          <w:sz w:val="22"/>
+          <w:szCs w:val="22"/>
+        </w:rPr>
+        <w:t xml:space="preserve"> chạy trên feature map 16×3×3 mà không đổi một tham số nào. Đây không phải mẹo lập trình mà là quan hệ toán học giữa hai lớp — và nó quyết định số khối phần cứng phải thiết kế ở project sau.</w:t>
+      </w:r>
+    </w:p>
+    <w:tbl>
+      <w:tblPr>
+        <w:tblW w:type="dxa" w:w="9026"/>
+        <w:tblBorders>
+          <w:top w:val="single" w:color="auto" w:sz="4"/>
+          <w:left w:val="single" w:color="auto" w:sz="4"/>
+          <w:bottom w:val="single" w:color="auto" w:sz="4"/>
+          <w:right w:val="single" w:color="auto" w:sz="4"/>
+          <w:insideH w:val="single" w:color="auto" w:sz="4"/>
+          <w:insideV w:val="single" w:color="auto" w:sz="4"/>
+        </w:tblBorders>
+      </w:tblPr>
+      <w:tblGrid>
+        <w:gridCol w:w="2000"/>
+        <w:gridCol w:w="2350"/>
+        <w:gridCol w:w="2350"/>
+        <w:gridCol w:w="2326"/>
+      </w:tblGrid>
+      <w:tr>
+        <w:trPr>
+          <w:tblHeader/>
+        </w:trPr>
+        <w:tc>
+          <w:tcPr>
+            <w:tcW w:type="dxa" w:w="2000"/>
+            <w:shd w:fill="0F2A44" w:val="clear"/>
+            <w:tcMar>
+              <w:top w:type="dxa" w:w="70"/>
+              <w:left w:type="dxa" w:w="110"/>
+              <w:bottom w:type="dxa" w:w="70"/>
+              <w:right w:type="dxa" w:w="110"/>
+            </w:tcMar>
+          </w:tcPr>
+          <w:p>
+            <w:pPr>
+              <w:spacing w:after="0"/>
+            </w:pPr>
+            <w:r>
+              <w:rPr>
+                <w:rFonts w:ascii="Calibri" w:cs="Calibri" w:eastAsia="Calibri" w:hAnsi="Calibri"/>
+                <w:b/>
+                <w:bCs/>
+                <w:color w:val="FFFFFF"/>
+                <w:sz w:val="19"/>
+                <w:szCs w:val="19"/>
+              </w:rPr>
+              <w:t xml:space="preserve">Phương án</w:t>
+            </w:r>
+          </w:p>
+        </w:tc>
+        <w:tc>
+          <w:tcPr>
+            <w:tcW w:type="dxa" w:w="2350"/>
+            <w:shd w:fill="0F2A44" w:val="clear"/>
+            <w:tcMar>
+              <w:top w:type="dxa" w:w="70"/>
+              <w:left w:type="dxa" w:w="110"/>
+              <w:bottom w:type="dxa" w:w="70"/>
+              <w:right w:type="dxa" w:w="110"/>
+            </w:tcMar>
+          </w:tcPr>
+          <w:p>
+            <w:pPr>
+              <w:spacing w:after="0"/>
+            </w:pPr>
+            <w:r>
+              <w:rPr>
+                <w:rFonts w:ascii="Calibri" w:cs="Calibri" w:eastAsia="Calibri" w:hAnsi="Calibri"/>
+                <w:b/>
+                <w:bCs/>
+                <w:color w:val="FFFFFF"/>
+                <w:sz w:val="19"/>
+                <w:szCs w:val="19"/>
+              </w:rPr>
+              <w:t xml:space="preserve">Cách hoạt động</w:t>
+            </w:r>
+          </w:p>
+        </w:tc>
+        <w:tc>
+          <w:tcPr>
+            <w:tcW w:type="dxa" w:w="2350"/>
+            <w:shd w:fill="0F2A44" w:val="clear"/>
+            <w:tcMar>
+              <w:top w:type="dxa" w:w="70"/>
+              <w:left w:type="dxa" w:w="110"/>
+              <w:bottom w:type="dxa" w:w="70"/>
+              <w:right w:type="dxa" w:w="110"/>
+            </w:tcMar>
+          </w:tcPr>
+          <w:p>
+            <w:pPr>
+              <w:spacing w:after="0"/>
+            </w:pPr>
+            <w:r>
+              <w:rPr>
+                <w:rFonts w:ascii="Calibri" w:cs="Calibri" w:eastAsia="Calibri" w:hAnsi="Calibri"/>
+                <w:b/>
+                <w:bCs/>
+                <w:color w:val="FFFFFF"/>
+                <w:sz w:val="19"/>
+                <w:szCs w:val="19"/>
+              </w:rPr>
+              <w:t xml:space="preserve">Ưu</w:t>
+            </w:r>
+          </w:p>
+        </w:tc>
+        <w:tc>
+          <w:tcPr>
+            <w:tcW w:type="dxa" w:w="2326"/>
+            <w:shd w:fill="0F2A44" w:val="clear"/>
+            <w:tcMar>
+              <w:top w:type="dxa" w:w="70"/>
+              <w:left w:type="dxa" w:w="110"/>
+              <w:bottom w:type="dxa" w:w="70"/>
+              <w:right w:type="dxa" w:w="110"/>
+            </w:tcMar>
+          </w:tcPr>
+          <w:p>
+            <w:pPr>
+              <w:spacing w:after="0"/>
+            </w:pPr>
+            <w:r>
+              <w:rPr>
+                <w:rFonts w:ascii="Calibri" w:cs="Calibri" w:eastAsia="Calibri" w:hAnsi="Calibri"/>
+                <w:b/>
+                <w:bCs/>
+                <w:color w:val="FFFFFF"/>
+                <w:sz w:val="19"/>
+                <w:szCs w:val="19"/>
+              </w:rPr>
+              <w:t xml:space="preserve">Nhược</w:t>
+            </w:r>
+          </w:p>
+        </w:tc>
+      </w:tr>
+      <w:tr>
+        <w:tc>
+          <w:tcPr>
+            <w:tcW w:type="dxa" w:w="2000"/>
+            <w:shd w:fill="F4F8FA" w:val="clear"/>
+            <w:tcMar>
+              <w:top w:type="dxa" w:w="70"/>
+              <w:left w:type="dxa" w:w="110"/>
+              <w:bottom w:type="dxa" w:w="70"/>
+              <w:right w:type="dxa" w:w="110"/>
+            </w:tcMar>
+          </w:tcPr>
+          <w:p>
+            <w:pPr>
+              <w:spacing w:after="0"/>
+            </w:pPr>
+            <w:r>
+              <w:rPr>
+                <w:rFonts w:ascii="Calibri" w:cs="Calibri" w:eastAsia="Calibri" w:hAnsi="Calibri"/>
+                <w:b/>
+                <w:bCs/>
+                <w:color w:val="1A2733"/>
+                <w:sz w:val="19"/>
+                <w:szCs w:val="19"/>
+              </w:rPr>
+              <w:t xml:space="preserve">Linear(144,10) (đang dùng)</w:t>
+            </w:r>
+          </w:p>
+        </w:tc>
+        <w:tc>
+          <w:tcPr>
+            <w:tcW w:type="dxa" w:w="2350"/>
+            <w:shd w:fill="F4F8FA" w:val="clear"/>
+            <w:tcMar>
+              <w:top w:type="dxa" w:w="70"/>
+              <w:left w:type="dxa" w:w="110"/>
+              <w:bottom w:type="dxa" w:w="70"/>
+              <w:right w:type="dxa" w:w="110"/>
+            </w:tcMar>
+          </w:tcPr>
+          <w:p>
+            <w:pPr>
+              <w:spacing w:after="0"/>
+            </w:pPr>
+            <w:r>
+              <w:rPr>
+                <w:rFonts w:ascii="Calibri" w:cs="Calibri" w:eastAsia="Calibri" w:hAnsi="Calibri"/>
+                <w:color w:val="1A2733"/>
+                <w:sz w:val="19"/>
+                <w:szCs w:val="19"/>
+              </w:rPr>
+              <w:t xml:space="preserve">Duỗi feature map thành vector 144 rồi nhân ma trận</w:t>
+            </w:r>
+          </w:p>
+        </w:tc>
+        <w:tc>
+          <w:tcPr>
+            <w:tcW w:type="dxa" w:w="2350"/>
+            <w:shd w:fill="F4F8FA" w:val="clear"/>
+            <w:tcMar>
+              <w:top w:type="dxa" w:w="70"/>
+              <w:left w:type="dxa" w:w="110"/>
+              <w:bottom w:type="dxa" w:w="70"/>
+              <w:right w:type="dxa" w:w="110"/>
+            </w:tcMar>
+          </w:tcPr>
+          <w:p>
+            <w:pPr>
+              <w:spacing w:after="0"/>
+            </w:pPr>
+            <w:r>
+              <w:rPr>
+                <w:rFonts w:ascii="Calibri" w:cs="Calibri" w:eastAsia="Calibri" w:hAnsi="Calibri"/>
+                <w:color w:val="1A2733"/>
+                <w:sz w:val="19"/>
+                <w:szCs w:val="19"/>
+              </w:rPr>
+              <w:t xml:space="preserve">Golden model C chỉ cần 2 vòng lặp lồng nhau</w:t>
+            </w:r>
+          </w:p>
+        </w:tc>
+        <w:tc>
+          <w:tcPr>
+            <w:tcW w:type="dxa" w:w="2326"/>
+            <w:shd w:fill="F4F8FA" w:val="clear"/>
+            <w:tcMar>
+              <w:top w:type="dxa" w:w="70"/>
+              <w:left w:type="dxa" w:w="110"/>
+              <w:bottom w:type="dxa" w:w="70"/>
+              <w:right w:type="dxa" w:w="110"/>
+            </w:tcMar>
+          </w:tcPr>
+          <w:p>
+            <w:pPr>
+              <w:spacing w:after="0"/>
+            </w:pPr>
+            <w:r>
+              <w:rPr>
+                <w:rFonts w:ascii="Calibri" w:cs="Calibri" w:eastAsia="Calibri" w:hAnsi="Calibri"/>
+                <w:color w:val="1A2733"/>
+                <w:sz w:val="19"/>
+                <w:szCs w:val="19"/>
+              </w:rPr>
+              <w:t xml:space="preserve">Phải có bước flatten riêng, dễ sai thứ tự NCHW</w:t>
+            </w:r>
+          </w:p>
+        </w:tc>
+      </w:tr>
+      <w:tr>
+        <w:tc>
+          <w:tcPr>
+            <w:tcW w:type="dxa" w:w="2000"/>
+            <w:tcMar>
+              <w:top w:type="dxa" w:w="70"/>
+              <w:left w:type="dxa" w:w="110"/>
+              <w:bottom w:type="dxa" w:w="70"/>
+              <w:right w:type="dxa" w:w="110"/>
+            </w:tcMar>
+          </w:tcPr>
+          <w:p>
+            <w:pPr>
+              <w:spacing w:after="0"/>
+            </w:pPr>
+            <w:r>
+              <w:rPr>
+                <w:rFonts w:ascii="Calibri" w:cs="Calibri" w:eastAsia="Calibri" w:hAnsi="Calibri"/>
+                <w:b/>
+                <w:bCs/>
+                <w:color w:val="1A2733"/>
+                <w:sz w:val="19"/>
+                <w:szCs w:val="19"/>
+              </w:rPr>
+              <w:t xml:space="preserve">Conv2d(16→10, k3, p0)</w:t>
+            </w:r>
+          </w:p>
+        </w:tc>
+        <w:tc>
+          <w:tcPr>
+            <w:tcW w:type="dxa" w:w="2350"/>
+            <w:tcMar>
+              <w:top w:type="dxa" w:w="70"/>
+              <w:left w:type="dxa" w:w="110"/>
+              <w:bottom w:type="dxa" w:w="70"/>
+              <w:right w:type="dxa" w:w="110"/>
+            </w:tcMar>
+          </w:tcPr>
+          <w:p>
+            <w:pPr>
+              <w:spacing w:after="0"/>
+            </w:pPr>
+            <w:r>
+              <w:rPr>
+                <w:rFonts w:ascii="Calibri" w:cs="Calibri" w:eastAsia="Calibri" w:hAnsi="Calibri"/>
+                <w:color w:val="1A2733"/>
+                <w:sz w:val="19"/>
+                <w:szCs w:val="19"/>
+              </w:rPr>
+              <w:t xml:space="preserve">Cửa sổ 3×3 đặt đúng 1 vị trí, phủ trọn feature map</w:t>
+            </w:r>
+          </w:p>
+        </w:tc>
+        <w:tc>
+          <w:tcPr>
+            <w:tcW w:type="dxa" w:w="2350"/>
+            <w:tcMar>
+              <w:top w:type="dxa" w:w="70"/>
+              <w:left w:type="dxa" w:w="110"/>
+              <w:bottom w:type="dxa" w:w="70"/>
+              <w:right w:type="dxa" w:w="110"/>
+            </w:tcMar>
+          </w:tcPr>
+          <w:p>
+            <w:pPr>
+              <w:spacing w:after="0"/>
+            </w:pPr>
+            <w:r>
+              <w:rPr>
+                <w:rFonts w:ascii="Calibri" w:cs="Calibri" w:eastAsia="Calibri" w:hAnsi="Calibri"/>
+                <w:color w:val="1A2733"/>
+                <w:sz w:val="19"/>
+                <w:szCs w:val="19"/>
+              </w:rPr>
+              <w:t xml:space="preserve">Dùng chung một khối phần cứng với conv1–conv3</w:t>
+            </w:r>
+          </w:p>
+        </w:tc>
+        <w:tc>
+          <w:tcPr>
+            <w:tcW w:type="dxa" w:w="2326"/>
+            <w:tcMar>
+              <w:top w:type="dxa" w:w="70"/>
+              <w:left w:type="dxa" w:w="110"/>
+              <w:bottom w:type="dxa" w:w="70"/>
+              <w:right w:type="dxa" w:w="110"/>
+            </w:tcMar>
+          </w:tcPr>
+          <w:p>
+            <w:pPr>
+              <w:spacing w:after="0"/>
+            </w:pPr>
+            <w:r>
+              <w:rPr>
+                <w:rFonts w:ascii="Calibri" w:cs="Calibri" w:eastAsia="Calibri" w:hAnsi="Calibri"/>
+                <w:color w:val="1A2733"/>
+                <w:sz w:val="19"/>
+                <w:szCs w:val="19"/>
+              </w:rPr>
+              <w:t xml:space="preserve">Golden model C phải viết 6 vòng lặp, nhiều chỗ sai hơn</w:t>
+            </w:r>
+          </w:p>
+        </w:tc>
+      </w:tr>
+    </w:tbl>
+    <w:p>
+      <w:pPr>
+        <w:spacing w:after="120" w:before="0"/>
+      </w:pPr>
+      <w:r>
+        <w:rPr>
+          <w:rFonts w:ascii="Calibri" w:cs="Calibri" w:eastAsia="Calibri" w:hAnsi="Calibri"/>
+          <w:color w:val="1A2733"/>
+          <w:sz w:val="22"/>
+          <w:szCs w:val="22"/>
+        </w:rPr>
+        <w:t xml:space="preserve">Hai cột số dưới đây là phần chứng minh — không phải ước lượng:</w:t>
+      </w:r>
+    </w:p>
+    <w:tbl>
+      <w:tblPr>
+        <w:tblW w:type="dxa" w:w="9026"/>
+        <w:tblBorders>
+          <w:top w:val="single" w:color="auto" w:sz="4"/>
+          <w:left w:val="single" w:color="auto" w:sz="4"/>
+          <w:bottom w:val="single" w:color="auto" w:sz="4"/>
+          <w:right w:val="single" w:color="auto" w:sz="4"/>
+          <w:insideH w:val="single" w:color="auto" w:sz="4"/>
+          <w:insideV w:val="single" w:color="auto" w:sz="4"/>
+        </w:tblBorders>
+      </w:tblPr>
+      <w:tblGrid>
+        <w:gridCol w:w="2600"/>
+        <w:gridCol w:w="3213"/>
+        <w:gridCol w:w="3213"/>
+      </w:tblGrid>
+      <w:tr>
+        <w:trPr>
+          <w:tblHeader/>
+        </w:trPr>
+        <w:tc>
+          <w:tcPr>
+            <w:tcW w:type="dxa" w:w="2600"/>
+            <w:shd w:fill="0F2A44" w:val="clear"/>
+            <w:tcMar>
+              <w:top w:type="dxa" w:w="70"/>
+              <w:left w:type="dxa" w:w="110"/>
+              <w:bottom w:type="dxa" w:w="70"/>
+              <w:right w:type="dxa" w:w="110"/>
+            </w:tcMar>
+          </w:tcPr>
+          <w:p>
+            <w:pPr>
+              <w:spacing w:after="0"/>
+            </w:pPr>
+            <w:r>
+              <w:rPr>
+                <w:rFonts w:ascii="Calibri" w:cs="Calibri" w:eastAsia="Calibri" w:hAnsi="Calibri"/>
+                <w:b/>
+                <w:bCs/>
+                <w:color w:val="FFFFFF"/>
+                <w:sz w:val="19"/>
+                <w:szCs w:val="19"/>
+              </w:rPr>
+              <w:t xml:space="preserve"/>
+            </w:r>
+          </w:p>
+        </w:tc>
+        <w:tc>
+          <w:tcPr>
+            <w:tcW w:type="dxa" w:w="3213"/>
+            <w:shd w:fill="0F2A44" w:val="clear"/>
+            <w:tcMar>
+              <w:top w:type="dxa" w:w="70"/>
+              <w:left w:type="dxa" w:w="110"/>
+              <w:bottom w:type="dxa" w:w="70"/>
+              <w:right w:type="dxa" w:w="110"/>
+            </w:tcMar>
+          </w:tcPr>
+          <w:p>
+            <w:pPr>
+              <w:spacing w:after="0"/>
+            </w:pPr>
+            <w:r>
+              <w:rPr>
+                <w:rFonts w:ascii="Calibri" w:cs="Calibri" w:eastAsia="Calibri" w:hAnsi="Calibri"/>
+                <w:b/>
+                <w:bCs/>
+                <w:color w:val="FFFFFF"/>
+                <w:sz w:val="19"/>
+                <w:szCs w:val="19"/>
+              </w:rPr>
+              <w:t xml:space="preserve">Linear(144, 10)</w:t>
+            </w:r>
+          </w:p>
+        </w:tc>
+        <w:tc>
+          <w:tcPr>
+            <w:tcW w:type="dxa" w:w="3213"/>
+            <w:shd w:fill="0F2A44" w:val="clear"/>
+            <w:tcMar>
+              <w:top w:type="dxa" w:w="70"/>
+              <w:left w:type="dxa" w:w="110"/>
+              <w:bottom w:type="dxa" w:w="70"/>
+              <w:right w:type="dxa" w:w="110"/>
+            </w:tcMar>
+          </w:tcPr>
+          <w:p>
+            <w:pPr>
+              <w:spacing w:after="0"/>
+            </w:pPr>
+            <w:r>
+              <w:rPr>
+                <w:rFonts w:ascii="Calibri" w:cs="Calibri" w:eastAsia="Calibri" w:hAnsi="Calibri"/>
+                <w:b/>
+                <w:bCs/>
+                <w:color w:val="FFFFFF"/>
+                <w:sz w:val="19"/>
+                <w:szCs w:val="19"/>
+              </w:rPr>
+              <w:t xml:space="preserve">Conv2d(16→10, k=3, p=0)</w:t>
+            </w:r>
+          </w:p>
+        </w:tc>
+      </w:tr>
+      <w:tr>
+        <w:tc>
+          <w:tcPr>
+            <w:tcW w:type="dxa" w:w="2600"/>
+            <w:shd w:fill="F4F8FA" w:val="clear"/>
+            <w:tcMar>
+              <w:top w:type="dxa" w:w="70"/>
+              <w:left w:type="dxa" w:w="110"/>
+              <w:bottom w:type="dxa" w:w="70"/>
+              <w:right w:type="dxa" w:w="110"/>
+            </w:tcMar>
+          </w:tcPr>
+          <w:p>
+            <w:pPr>
+              <w:spacing w:after="0"/>
+            </w:pPr>
+            <w:r>
+              <w:rPr>
+                <w:rFonts w:ascii="Calibri" w:cs="Calibri" w:eastAsia="Calibri" w:hAnsi="Calibri"/>
+                <w:b/>
+                <w:bCs/>
+                <w:color w:val="1A2733"/>
+                <w:sz w:val="19"/>
+                <w:szCs w:val="19"/>
+              </w:rPr>
+              <w:t xml:space="preserve">Công thức params</w:t>
+            </w:r>
+          </w:p>
+        </w:tc>
+        <w:tc>
+          <w:tcPr>
+            <w:tcW w:type="dxa" w:w="3213"/>
+            <w:shd w:fill="F4F8FA" w:val="clear"/>
+            <w:tcMar>
+              <w:top w:type="dxa" w:w="70"/>
+              <w:left w:type="dxa" w:w="110"/>
+              <w:bottom w:type="dxa" w:w="70"/>
+              <w:right w:type="dxa" w:w="110"/>
+            </w:tcMar>
+          </w:tcPr>
+          <w:p>
+            <w:pPr>
+              <w:spacing w:after="0"/>
+            </w:pPr>
+            <w:r>
+              <w:rPr>
+                <w:rFonts w:ascii="Calibri" w:cs="Calibri" w:eastAsia="Calibri" w:hAnsi="Calibri"/>
+                <w:color w:val="1A2733"/>
+                <w:sz w:val="19"/>
+                <w:szCs w:val="19"/>
+              </w:rPr>
+              <w:t xml:space="preserve">in × out + out</w:t>
+            </w:r>
+          </w:p>
+        </w:tc>
+        <w:tc>
+          <w:tcPr>
+            <w:tcW w:type="dxa" w:w="3213"/>
+            <w:shd w:fill="F4F8FA" w:val="clear"/>
+            <w:tcMar>
+              <w:top w:type="dxa" w:w="70"/>
+              <w:left w:type="dxa" w:w="110"/>
+              <w:bottom w:type="dxa" w:w="70"/>
+              <w:right w:type="dxa" w:w="110"/>
+            </w:tcMar>
+          </w:tcPr>
+          <w:p>
+            <w:pPr>
+              <w:spacing w:after="0"/>
+            </w:pPr>
+            <w:r>
+              <w:rPr>
+                <w:rFonts w:ascii="Calibri" w:cs="Calibri" w:eastAsia="Calibri" w:hAnsi="Calibri"/>
+                <w:color w:val="1A2733"/>
+                <w:sz w:val="19"/>
+                <w:szCs w:val="19"/>
+              </w:rPr>
+              <w:t xml:space="preserve">k × k × in_ch × out_ch + out_ch</w:t>
+            </w:r>
+          </w:p>
+        </w:tc>
+      </w:tr>
+      <w:tr>
+        <w:tc>
+          <w:tcPr>
+            <w:tcW w:type="dxa" w:w="2600"/>
+            <w:tcMar>
+              <w:top w:type="dxa" w:w="70"/>
+              <w:left w:type="dxa" w:w="110"/>
+              <w:bottom w:type="dxa" w:w="70"/>
+              <w:right w:type="dxa" w:w="110"/>
+            </w:tcMar>
+          </w:tcPr>
+          <w:p>
+            <w:pPr>
+              <w:spacing w:after="0"/>
+            </w:pPr>
+            <w:r>
+              <w:rPr>
+                <w:rFonts w:ascii="Calibri" w:cs="Calibri" w:eastAsia="Calibri" w:hAnsi="Calibri"/>
+                <w:b/>
+                <w:bCs/>
+                <w:color w:val="1A2733"/>
+                <w:sz w:val="19"/>
+                <w:szCs w:val="19"/>
+              </w:rPr>
+              <w:t xml:space="preserve">Thay số</w:t>
+            </w:r>
+          </w:p>
+        </w:tc>
+        <w:tc>
+          <w:tcPr>
+            <w:tcW w:type="dxa" w:w="3213"/>
+            <w:tcMar>
+              <w:top w:type="dxa" w:w="70"/>
+              <w:left w:type="dxa" w:w="110"/>
+              <w:bottom w:type="dxa" w:w="70"/>
+              <w:right w:type="dxa" w:w="110"/>
+            </w:tcMar>
+          </w:tcPr>
+          <w:p>
+            <w:pPr>
+              <w:spacing w:after="0"/>
+            </w:pPr>
+            <w:r>
+              <w:rPr>
+                <w:rFonts w:ascii="Calibri" w:cs="Calibri" w:eastAsia="Calibri" w:hAnsi="Calibri"/>
+                <w:color w:val="1A2733"/>
+                <w:sz w:val="19"/>
+                <w:szCs w:val="19"/>
+              </w:rPr>
+              <w:t xml:space="preserve">144 × 10 + 10</w:t>
+            </w:r>
+          </w:p>
+        </w:tc>
+        <w:tc>
+          <w:tcPr>
+            <w:tcW w:type="dxa" w:w="3213"/>
+            <w:tcMar>
+              <w:top w:type="dxa" w:w="70"/>
+              <w:left w:type="dxa" w:w="110"/>
+              <w:bottom w:type="dxa" w:w="70"/>
+              <w:right w:type="dxa" w:w="110"/>
+            </w:tcMar>
+          </w:tcPr>
+          <w:p>
+            <w:pPr>
+              <w:spacing w:after="0"/>
+            </w:pPr>
+            <w:r>
+              <w:rPr>
+                <w:rFonts w:ascii="Calibri" w:cs="Calibri" w:eastAsia="Calibri" w:hAnsi="Calibri"/>
+                <w:color w:val="1A2733"/>
+                <w:sz w:val="19"/>
+                <w:szCs w:val="19"/>
+              </w:rPr>
+              <w:t xml:space="preserve">3 × 3 × 16 × 10 + 10</w:t>
+            </w:r>
+          </w:p>
+        </w:tc>
+      </w:tr>
+      <w:tr>
+        <w:tc>
+          <w:tcPr>
+            <w:tcW w:type="dxa" w:w="2600"/>
+            <w:shd w:fill="F4F8FA" w:val="clear"/>
+            <w:tcMar>
+              <w:top w:type="dxa" w:w="70"/>
+              <w:left w:type="dxa" w:w="110"/>
+              <w:bottom w:type="dxa" w:w="70"/>
+              <w:right w:type="dxa" w:w="110"/>
+            </w:tcMar>
+          </w:tcPr>
+          <w:p>
+            <w:pPr>
+              <w:spacing w:after="0"/>
+            </w:pPr>
+            <w:r>
+              <w:rPr>
+                <w:rFonts w:ascii="Calibri" w:cs="Calibri" w:eastAsia="Calibri" w:hAnsi="Calibri"/>
+                <w:b/>
+                <w:bCs/>
+                <w:color w:val="1A2733"/>
+                <w:sz w:val="19"/>
+                <w:szCs w:val="19"/>
+              </w:rPr>
+              <w:t xml:space="preserve">Params</w:t>
+            </w:r>
+          </w:p>
+        </w:tc>
+        <w:tc>
+          <w:tcPr>
+            <w:tcW w:type="dxa" w:w="3213"/>
+            <w:shd w:fill="F4F8FA" w:val="clear"/>
+            <w:tcMar>
+              <w:top w:type="dxa" w:w="70"/>
+              <w:left w:type="dxa" w:w="110"/>
+              <w:bottom w:type="dxa" w:w="70"/>
+              <w:right w:type="dxa" w:w="110"/>
+            </w:tcMar>
+          </w:tcPr>
+          <w:p>
+            <w:pPr>
+              <w:spacing w:after="0"/>
+            </w:pPr>
+            <w:r>
+              <w:rPr>
+                <w:rFonts w:ascii="Calibri" w:cs="Calibri" w:eastAsia="Calibri" w:hAnsi="Calibri"/>
+                <w:color w:val="1A2733"/>
+                <w:sz w:val="19"/>
+                <w:szCs w:val="19"/>
+              </w:rPr>
+              <w:t xml:space="preserve">1.450</w:t>
+            </w:r>
+          </w:p>
+        </w:tc>
+        <w:tc>
+          <w:tcPr>
+            <w:tcW w:type="dxa" w:w="3213"/>
+            <w:shd w:fill="F4F8FA" w:val="clear"/>
+            <w:tcMar>
+              <w:top w:type="dxa" w:w="70"/>
+              <w:left w:type="dxa" w:w="110"/>
+              <w:bottom w:type="dxa" w:w="70"/>
+              <w:right w:type="dxa" w:w="110"/>
+            </w:tcMar>
+          </w:tcPr>
+          <w:p>
+            <w:pPr>
+              <w:spacing w:after="0"/>
+            </w:pPr>
+            <w:r>
+              <w:rPr>
+                <w:rFonts w:ascii="Calibri" w:cs="Calibri" w:eastAsia="Calibri" w:hAnsi="Calibri"/>
+                <w:color w:val="1A2733"/>
+                <w:sz w:val="19"/>
+                <w:szCs w:val="19"/>
+              </w:rPr>
+              <w:t xml:space="preserve">1.450</w:t>
+            </w:r>
+          </w:p>
+        </w:tc>
+      </w:tr>
+      <w:tr>
+        <w:tc>
+          <w:tcPr>
+            <w:tcW w:type="dxa" w:w="2600"/>
+            <w:tcMar>
+              <w:top w:type="dxa" w:w="70"/>
+              <w:left w:type="dxa" w:w="110"/>
+              <w:bottom w:type="dxa" w:w="70"/>
+              <w:right w:type="dxa" w:w="110"/>
+            </w:tcMar>
+          </w:tcPr>
+          <w:p>
+            <w:pPr>
+              <w:spacing w:after="0"/>
+            </w:pPr>
+            <w:r>
+              <w:rPr>
+                <w:rFonts w:ascii="Calibri" w:cs="Calibri" w:eastAsia="Calibri" w:hAnsi="Calibri"/>
+                <w:b/>
+                <w:bCs/>
+                <w:color w:val="1A2733"/>
+                <w:sz w:val="19"/>
+                <w:szCs w:val="19"/>
+              </w:rPr>
+              <w:t xml:space="preserve">MAC mỗi ảnh</w:t>
+            </w:r>
+          </w:p>
+        </w:tc>
+        <w:tc>
+          <w:tcPr>
+            <w:tcW w:type="dxa" w:w="3213"/>
+            <w:tcMar>
+              <w:top w:type="dxa" w:w="70"/>
+              <w:left w:type="dxa" w:w="110"/>
+              <w:bottom w:type="dxa" w:w="70"/>
+              <w:right w:type="dxa" w:w="110"/>
+            </w:tcMar>
+          </w:tcPr>
+          <w:p>
+            <w:pPr>
+              <w:spacing w:after="0"/>
+            </w:pPr>
+            <w:r>
+              <w:rPr>
+                <w:rFonts w:ascii="Calibri" w:cs="Calibri" w:eastAsia="Calibri" w:hAnsi="Calibri"/>
+                <w:color w:val="1A2733"/>
+                <w:sz w:val="19"/>
+                <w:szCs w:val="19"/>
+              </w:rPr>
+              <w:t xml:space="preserve">1.440</w:t>
+            </w:r>
+          </w:p>
+        </w:tc>
+        <w:tc>
+          <w:tcPr>
+            <w:tcW w:type="dxa" w:w="3213"/>
+            <w:tcMar>
+              <w:top w:type="dxa" w:w="70"/>
+              <w:left w:type="dxa" w:w="110"/>
+              <w:bottom w:type="dxa" w:w="70"/>
+              <w:right w:type="dxa" w:w="110"/>
+            </w:tcMar>
+          </w:tcPr>
+          <w:p>
+            <w:pPr>
+              <w:spacing w:after="0"/>
+            </w:pPr>
+            <w:r>
+              <w:rPr>
+                <w:rFonts w:ascii="Calibri" w:cs="Calibri" w:eastAsia="Calibri" w:hAnsi="Calibri"/>
+                <w:color w:val="1A2733"/>
+                <w:sz w:val="19"/>
+                <w:szCs w:val="19"/>
+              </w:rPr>
+              <w:t xml:space="preserve">1.440</w:t>
+            </w:r>
+          </w:p>
+        </w:tc>
+      </w:tr>
+      <w:tr>
+        <w:tc>
+          <w:tcPr>
+            <w:tcW w:type="dxa" w:w="2600"/>
+            <w:shd w:fill="F4F8FA" w:val="clear"/>
+            <w:tcMar>
+              <w:top w:type="dxa" w:w="70"/>
+              <w:left w:type="dxa" w:w="110"/>
+              <w:bottom w:type="dxa" w:w="70"/>
+              <w:right w:type="dxa" w:w="110"/>
+            </w:tcMar>
+          </w:tcPr>
+          <w:p>
+            <w:pPr>
+              <w:spacing w:after="0"/>
+            </w:pPr>
+            <w:r>
+              <w:rPr>
+                <w:rFonts w:ascii="Calibri" w:cs="Calibri" w:eastAsia="Calibri" w:hAnsi="Calibri"/>
+                <w:b/>
+                <w:bCs/>
+                <w:color w:val="1A2733"/>
+                <w:sz w:val="19"/>
+                <w:szCs w:val="19"/>
+              </w:rPr>
+              <w:t xml:space="preserve">Shape đầu ra</w:t>
+            </w:r>
+          </w:p>
+        </w:tc>
+        <w:tc>
+          <w:tcPr>
+            <w:tcW w:type="dxa" w:w="3213"/>
+            <w:shd w:fill="F4F8FA" w:val="clear"/>
+            <w:tcMar>
+              <w:top w:type="dxa" w:w="70"/>
+              <w:left w:type="dxa" w:w="110"/>
+              <w:bottom w:type="dxa" w:w="70"/>
+              <w:right w:type="dxa" w:w="110"/>
+            </w:tcMar>
+          </w:tcPr>
+          <w:p>
+            <w:pPr>
+              <w:spacing w:after="0"/>
+            </w:pPr>
+            <w:r>
+              <w:rPr>
+                <w:rFonts w:ascii="Calibri" w:cs="Calibri" w:eastAsia="Calibri" w:hAnsi="Calibri"/>
+                <w:color w:val="1A2733"/>
+                <w:sz w:val="19"/>
+                <w:szCs w:val="19"/>
+              </w:rPr>
+              <w:t xml:space="preserve">10</w:t>
+            </w:r>
+          </w:p>
+        </w:tc>
+        <w:tc>
+          <w:tcPr>
+            <w:tcW w:type="dxa" w:w="3213"/>
+            <w:shd w:fill="F4F8FA" w:val="clear"/>
+            <w:tcMar>
+              <w:top w:type="dxa" w:w="70"/>
+              <w:left w:type="dxa" w:w="110"/>
+              <w:bottom w:type="dxa" w:w="70"/>
+              <w:right w:type="dxa" w:w="110"/>
+            </w:tcMar>
+          </w:tcPr>
+          <w:p>
+            <w:pPr>
+              <w:spacing w:after="0"/>
+            </w:pPr>
+            <w:r>
+              <w:rPr>
+                <w:rFonts w:ascii="Calibri" w:cs="Calibri" w:eastAsia="Calibri" w:hAnsi="Calibri"/>
+                <w:color w:val="1A2733"/>
+                <w:sz w:val="19"/>
+                <w:szCs w:val="19"/>
+              </w:rPr>
+              <w:t xml:space="preserve">10 × 1 × 1</w:t>
+            </w:r>
+          </w:p>
+        </w:tc>
+      </w:tr>
+    </w:tbl>
+    <w:p>
+      <w:pPr>
+        <w:spacing w:after="120" w:before="0"/>
+      </w:pPr>
+      <w:r>
+        <w:rPr>
+          <w:rFonts w:ascii="Calibri" w:cs="Calibri" w:eastAsia="Calibri" w:hAnsi="Calibri"/>
+          <w:b/>
+          <w:bCs/>
+          <w:color w:val="1A2733"/>
+          <w:sz w:val="22"/>
+          <w:szCs w:val="22"/>
+        </w:rPr>
+        <w:t xml:space="preserve">Vì sao bằng nhau. </w:t>
+      </w:r>
+      <w:r>
+        <w:rPr>
+          <w:rFonts w:ascii="Calibri" w:cs="Calibri" w:eastAsia="Calibri" w:hAnsi="Calibri"/>
+          <w:color w:val="1A2733"/>
+          <w:sz w:val="22"/>
+          <w:szCs w:val="22"/>
+        </w:rPr>
+        <w:t xml:space="preserve">Với kernel 3 trên feature map 3×3 và padding 0, công thức kích thước đầu ra cho H_out = floor((3 + 0 − 3) / 1) + 1 = 1. Cửa sổ chỉ đặt được đúng một vị trí và phủ trọn feature map, không trượt đi đâu. Mà tích chập khi cửa sổ không trượt chính là phép nhân ma trận — nên Conv2d thoái hoá thành Linear.</w:t>
+      </w:r>
+    </w:p>
+    <w:p>
+      <w:pPr>
+        <w:spacing w:after="120" w:before="0"/>
+      </w:pPr>
+      <w:r>
+        <w:rPr>
+          <w:rFonts w:ascii="Calibri" w:cs="Calibri" w:eastAsia="Calibri" w:hAnsi="Calibri"/>
+          <w:b/>
+          <w:bCs/>
+          <w:color w:val="1A2733"/>
+          <w:sz w:val="22"/>
+          <w:szCs w:val="22"/>
+        </w:rPr>
+        <w:t xml:space="preserve">Đổi qua lại không cần train lại. </w:t>
+      </w:r>
+      <w:r>
+        <w:rPr>
+          <w:rFonts w:ascii="Calibri" w:cs="Calibri" w:eastAsia="Calibri" w:hAnsi="Calibri"/>
+          <w:color w:val="1A2733"/>
+          <w:sz w:val="22"/>
+          <w:szCs w:val="22"/>
+        </w:rPr>
+        <w:t xml:space="preserve">Trọng số của fc có shape [10, 144]; conv cần [10, 16, 3, 3]. Mà 144 = 16×3×3 và flatten đánh chỉ số theo NCHW (i = c·9 + h·3 + w) — đúng bằng thứ tự chiều của conv. Nên chỉ cần conv.weight = fc.weight.view(10, 16, 3, 3) và copy nguyên bias; checkpoint hiện tại dùng lại được, không mất một trọng số nào. Chính điều này là bằng chứng mạnh nhất: hai lớp đang đọc cùng một mảng số, chỉ khác cách đánh chỉ số.</w:t>
+      </w:r>
+    </w:p>
+    <w:p>
+      <w:pPr>
+        <w:spacing w:after="120" w:before="0"/>
+      </w:pPr>
+      <w:r>
+        <w:rPr>
+          <w:rFonts w:ascii="Calibri" w:cs="Calibri" w:eastAsia="Calibri" w:hAnsi="Calibri"/>
+          <w:b/>
+          <w:bCs/>
+          <w:color w:val="1A2733"/>
+          <w:sz w:val="22"/>
+          <w:szCs w:val="22"/>
+        </w:rPr>
+        <w:t xml:space="preserve">Đã đo, không phải ước lượng. </w:t>
+      </w:r>
+      <w:r>
+        <w:rPr>
+          <w:rFonts w:ascii="Calibri" w:cs="Calibri" w:eastAsia="Calibri" w:hAnsi="Calibri"/>
+          <w:color w:val="1A2733"/>
+          <w:sz w:val="22"/>
+          <w:szCs w:val="22"/>
+        </w:rPr>
+        <w:t xml:space="preserve">Script study/kiem_linear_vs_conv.py dựng lớp conv từ chính trọng số fc đã train rồi chạy cả hai trên 10.000 ảnh test, so từng phần tử trong 100.000 giá trị logit:</w:t>
+      </w:r>
+    </w:p>
+    <w:tbl>
+      <w:tblPr>
+        <w:tblW w:type="dxa" w:w="9026"/>
+        <w:tblBorders>
+          <w:top w:val="single" w:color="auto" w:sz="4"/>
+          <w:left w:val="single" w:color="auto" w:sz="4"/>
+          <w:bottom w:val="single" w:color="auto" w:sz="4"/>
+          <w:right w:val="single" w:color="auto" w:sz="4"/>
+          <w:insideH w:val="single" w:color="auto" w:sz="4"/>
+          <w:insideV w:val="single" w:color="auto" w:sz="4"/>
+        </w:tblBorders>
+      </w:tblPr>
+      <w:tblGrid>
+        <w:gridCol w:w="3800"/>
+        <w:gridCol w:w="2400"/>
+        <w:gridCol w:w="2826"/>
+      </w:tblGrid>
+      <w:tr>
+        <w:trPr>
+          <w:tblHeader/>
+        </w:trPr>
+        <w:tc>
+          <w:tcPr>
+            <w:tcW w:type="dxa" w:w="3800"/>
+            <w:shd w:fill="0F2A44" w:val="clear"/>
+            <w:tcMar>
+              <w:top w:type="dxa" w:w="70"/>
+              <w:left w:type="dxa" w:w="110"/>
+              <w:bottom w:type="dxa" w:w="70"/>
+              <w:right w:type="dxa" w:w="110"/>
+            </w:tcMar>
+          </w:tcPr>
+          <w:p>
+            <w:pPr>
+              <w:spacing w:after="0"/>
+            </w:pPr>
+            <w:r>
+              <w:rPr>
+                <w:rFonts w:ascii="Calibri" w:cs="Calibri" w:eastAsia="Calibri" w:hAnsi="Calibri"/>
+                <w:b/>
+                <w:bCs/>
+                <w:color w:val="FFFFFF"/>
+                <w:sz w:val="19"/>
+                <w:szCs w:val="19"/>
+              </w:rPr>
+              <w:t xml:space="preserve">Đại lượng</w:t>
+            </w:r>
+          </w:p>
+        </w:tc>
+        <w:tc>
+          <w:tcPr>
+            <w:tcW w:type="dxa" w:w="2400"/>
+            <w:shd w:fill="0F2A44" w:val="clear"/>
+            <w:tcMar>
+              <w:top w:type="dxa" w:w="70"/>
+              <w:left w:type="dxa" w:w="110"/>
+              <w:bottom w:type="dxa" w:w="70"/>
+              <w:right w:type="dxa" w:w="110"/>
+            </w:tcMar>
+          </w:tcPr>
+          <w:p>
+            <w:pPr>
+              <w:spacing w:after="0"/>
+            </w:pPr>
+            <w:r>
+              <w:rPr>
+                <w:rFonts w:ascii="Calibri" w:cs="Calibri" w:eastAsia="Calibri" w:hAnsi="Calibri"/>
+                <w:b/>
+                <w:bCs/>
+                <w:color w:val="FFFFFF"/>
+                <w:sz w:val="19"/>
+                <w:szCs w:val="19"/>
+              </w:rPr>
+              <w:t xml:space="preserve">Đo được</w:t>
+            </w:r>
+          </w:p>
+        </w:tc>
+        <w:tc>
+          <w:tcPr>
+            <w:tcW w:type="dxa" w:w="2826"/>
+            <w:shd w:fill="0F2A44" w:val="clear"/>
+            <w:tcMar>
+              <w:top w:type="dxa" w:w="70"/>
+              <w:left w:type="dxa" w:w="110"/>
+              <w:bottom w:type="dxa" w:w="70"/>
+              <w:right w:type="dxa" w:w="110"/>
+            </w:tcMar>
+          </w:tcPr>
+          <w:p>
+            <w:pPr>
+              <w:spacing w:after="0"/>
+            </w:pPr>
+            <w:r>
+              <w:rPr>
+                <w:rFonts w:ascii="Calibri" w:cs="Calibri" w:eastAsia="Calibri" w:hAnsi="Calibri"/>
+                <w:b/>
+                <w:bCs/>
+                <w:color w:val="FFFFFF"/>
+                <w:sz w:val="19"/>
+                <w:szCs w:val="19"/>
+              </w:rPr>
+              <w:t xml:space="preserve">Đọc thế nào</w:t>
+            </w:r>
+          </w:p>
+        </w:tc>
+      </w:tr>
+      <w:tr>
+        <w:tc>
+          <w:tcPr>
+            <w:tcW w:type="dxa" w:w="3800"/>
+            <w:shd w:fill="F4F8FA" w:val="clear"/>
+            <w:tcMar>
+              <w:top w:type="dxa" w:w="70"/>
+              <w:left w:type="dxa" w:w="110"/>
+              <w:bottom w:type="dxa" w:w="70"/>
+              <w:right w:type="dxa" w:w="110"/>
+            </w:tcMar>
+          </w:tcPr>
+          <w:p>
+            <w:pPr>
+              <w:spacing w:after="0"/>
+            </w:pPr>
+            <w:r>
+              <w:rPr>
+                <w:rFonts w:ascii="Calibri" w:cs="Calibri" w:eastAsia="Calibri" w:hAnsi="Calibri"/>
+                <w:b/>
+                <w:bCs/>
+                <w:color w:val="1A2733"/>
+                <w:sz w:val="19"/>
+                <w:szCs w:val="19"/>
+              </w:rPr>
+              <w:t xml:space="preserve">Sai lệch tuyệt đối lớn nhất</w:t>
+            </w:r>
+          </w:p>
+        </w:tc>
+        <w:tc>
+          <w:tcPr>
+            <w:tcW w:type="dxa" w:w="2400"/>
+            <w:shd w:fill="F4F8FA" w:val="clear"/>
+            <w:tcMar>
+              <w:top w:type="dxa" w:w="70"/>
+              <w:left w:type="dxa" w:w="110"/>
+              <w:bottom w:type="dxa" w:w="70"/>
+              <w:right w:type="dxa" w:w="110"/>
+            </w:tcMar>
+          </w:tcPr>
+          <w:p>
+            <w:pPr>
+              <w:spacing w:after="0"/>
+            </w:pPr>
+            <w:r>
+              <w:rPr>
+                <w:rFonts w:ascii="Calibri" w:cs="Calibri" w:eastAsia="Calibri" w:hAnsi="Calibri"/>
+                <w:color w:val="1A2733"/>
+                <w:sz w:val="19"/>
+                <w:szCs w:val="19"/>
+              </w:rPr>
+              <w:t xml:space="preserve">2,174e-04</w:t>
+            </w:r>
+          </w:p>
+        </w:tc>
+        <w:tc>
+          <w:tcPr>
+            <w:tcW w:type="dxa" w:w="2826"/>
+            <w:shd w:fill="F4F8FA" w:val="clear"/>
+            <w:tcMar>
+              <w:top w:type="dxa" w:w="70"/>
+              <w:left w:type="dxa" w:w="110"/>
+              <w:bottom w:type="dxa" w:w="70"/>
+              <w:right w:type="dxa" w:w="110"/>
+            </w:tcMar>
+          </w:tcPr>
+          <w:p>
+            <w:pPr>
+              <w:spacing w:after="0"/>
+            </w:pPr>
+            <w:r>
+              <w:rPr>
+                <w:rFonts w:ascii="Calibri" w:cs="Calibri" w:eastAsia="Calibri" w:hAnsi="Calibri"/>
+                <w:color w:val="1A2733"/>
+                <w:sz w:val="19"/>
+                <w:szCs w:val="19"/>
+              </w:rPr>
+              <w:t xml:space="preserve">Nghe thì lớn — xem hai dòng dưới</w:t>
+            </w:r>
+          </w:p>
+        </w:tc>
+      </w:tr>
+      <w:tr>
+        <w:tc>
+          <w:tcPr>
+            <w:tcW w:type="dxa" w:w="3800"/>
+            <w:tcMar>
+              <w:top w:type="dxa" w:w="70"/>
+              <w:left w:type="dxa" w:w="110"/>
+              <w:bottom w:type="dxa" w:w="70"/>
+              <w:right w:type="dxa" w:w="110"/>
+            </w:tcMar>
+          </w:tcPr>
+          <w:p>
+            <w:pPr>
+              <w:spacing w:after="0"/>
+            </w:pPr>
+            <w:r>
+              <w:rPr>
+                <w:rFonts w:ascii="Calibri" w:cs="Calibri" w:eastAsia="Calibri" w:hAnsi="Calibri"/>
+                <w:b/>
+                <w:bCs/>
+                <w:color w:val="1A2733"/>
+                <w:sz w:val="19"/>
+                <w:szCs w:val="19"/>
+              </w:rPr>
+              <w:t xml:space="preserve">Logit lớn nhất</w:t>
+            </w:r>
+          </w:p>
+        </w:tc>
+        <w:tc>
+          <w:tcPr>
+            <w:tcW w:type="dxa" w:w="2400"/>
+            <w:tcMar>
+              <w:top w:type="dxa" w:w="70"/>
+              <w:left w:type="dxa" w:w="110"/>
+              <w:bottom w:type="dxa" w:w="70"/>
+              <w:right w:type="dxa" w:w="110"/>
+            </w:tcMar>
+          </w:tcPr>
+          <w:p>
+            <w:pPr>
+              <w:spacing w:after="0"/>
+            </w:pPr>
+            <w:r>
+              <w:rPr>
+                <w:rFonts w:ascii="Calibri" w:cs="Calibri" w:eastAsia="Calibri" w:hAnsi="Calibri"/>
+                <w:color w:val="1A2733"/>
+                <w:sz w:val="19"/>
+                <w:szCs w:val="19"/>
+              </w:rPr>
+              <w:t xml:space="preserve">60,356</w:t>
+            </w:r>
+          </w:p>
+        </w:tc>
+        <w:tc>
+          <w:tcPr>
+            <w:tcW w:type="dxa" w:w="2826"/>
+            <w:tcMar>
+              <w:top w:type="dxa" w:w="70"/>
+              <w:left w:type="dxa" w:w="110"/>
+              <w:bottom w:type="dxa" w:w="70"/>
+              <w:right w:type="dxa" w:w="110"/>
+            </w:tcMar>
+          </w:tcPr>
+          <w:p>
+            <w:pPr>
+              <w:spacing w:after="0"/>
+            </w:pPr>
+            <w:r>
+              <w:rPr>
+                <w:rFonts w:ascii="Calibri" w:cs="Calibri" w:eastAsia="Calibri" w:hAnsi="Calibri"/>
+                <w:color w:val="1A2733"/>
+                <w:sz w:val="19"/>
+                <w:szCs w:val="19"/>
+              </w:rPr>
+              <w:t xml:space="preserve">Giá trị càng lớn, sai số tuyệt đối càng lớn theo</w:t>
+            </w:r>
+          </w:p>
+        </w:tc>
+      </w:tr>
+      <w:tr>
+        <w:tc>
+          <w:tcPr>
+            <w:tcW w:type="dxa" w:w="3800"/>
+            <w:shd w:fill="F4F8FA" w:val="clear"/>
+            <w:tcMar>
+              <w:top w:type="dxa" w:w="70"/>
+              <w:left w:type="dxa" w:w="110"/>
+              <w:bottom w:type="dxa" w:w="70"/>
+              <w:right w:type="dxa" w:w="110"/>
+            </w:tcMar>
+          </w:tcPr>
+          <w:p>
+            <w:pPr>
+              <w:spacing w:after="0"/>
+            </w:pPr>
+            <w:r>
+              <w:rPr>
+                <w:rFonts w:ascii="Calibri" w:cs="Calibri" w:eastAsia="Calibri" w:hAnsi="Calibri"/>
+                <w:b/>
+                <w:bCs/>
+                <w:color w:val="1A2733"/>
+                <w:sz w:val="19"/>
+                <w:szCs w:val="19"/>
+              </w:rPr>
+              <w:t xml:space="preserve">Sai lệch tương đối</w:t>
+            </w:r>
+          </w:p>
+        </w:tc>
+        <w:tc>
+          <w:tcPr>
+            <w:tcW w:type="dxa" w:w="2400"/>
+            <w:shd w:fill="F4F8FA" w:val="clear"/>
+            <w:tcMar>
+              <w:top w:type="dxa" w:w="70"/>
+              <w:left w:type="dxa" w:w="110"/>
+              <w:bottom w:type="dxa" w:w="70"/>
+              <w:right w:type="dxa" w:w="110"/>
+            </w:tcMar>
+          </w:tcPr>
+          <w:p>
+            <w:pPr>
+              <w:spacing w:after="0"/>
+            </w:pPr>
+            <w:r>
+              <w:rPr>
+                <w:rFonts w:ascii="Calibri" w:cs="Calibri" w:eastAsia="Calibri" w:hAnsi="Calibri"/>
+                <w:color w:val="1A2733"/>
+                <w:sz w:val="19"/>
+                <w:szCs w:val="19"/>
+              </w:rPr>
+              <w:t xml:space="preserve">3,603e-06</w:t>
+            </w:r>
+          </w:p>
+        </w:tc>
+        <w:tc>
+          <w:tcPr>
+            <w:tcW w:type="dxa" w:w="2826"/>
+            <w:shd w:fill="F4F8FA" w:val="clear"/>
+            <w:tcMar>
+              <w:top w:type="dxa" w:w="70"/>
+              <w:left w:type="dxa" w:w="110"/>
+              <w:bottom w:type="dxa" w:w="70"/>
+              <w:right w:type="dxa" w:w="110"/>
+            </w:tcMar>
+          </w:tcPr>
+          <w:p>
+            <w:pPr>
+              <w:spacing w:after="0"/>
+            </w:pPr>
+            <w:r>
+              <w:rPr>
+                <w:rFonts w:ascii="Calibri" w:cs="Calibri" w:eastAsia="Calibri" w:hAnsi="Calibri"/>
+                <w:color w:val="1A2733"/>
+                <w:sz w:val="19"/>
+                <w:szCs w:val="19"/>
+              </w:rPr>
+              <w:t xml:space="preserve">Bằng 30 lần eps của float32 — nhiễu bình thường</w:t>
+            </w:r>
+          </w:p>
+        </w:tc>
+      </w:tr>
+      <w:tr>
+        <w:tc>
+          <w:tcPr>
+            <w:tcW w:type="dxa" w:w="3800"/>
+            <w:tcMar>
+              <w:top w:type="dxa" w:w="70"/>
+              <w:left w:type="dxa" w:w="110"/>
+              <w:bottom w:type="dxa" w:w="70"/>
+              <w:right w:type="dxa" w:w="110"/>
+            </w:tcMar>
+          </w:tcPr>
+          <w:p>
+            <w:pPr>
+              <w:spacing w:after="0"/>
+            </w:pPr>
+            <w:r>
+              <w:rPr>
+                <w:rFonts w:ascii="Calibri" w:cs="Calibri" w:eastAsia="Calibri" w:hAnsi="Calibri"/>
+                <w:b/>
+                <w:bCs/>
+                <w:color w:val="1A2733"/>
+                <w:sz w:val="19"/>
+                <w:szCs w:val="19"/>
+              </w:rPr>
+              <w:t xml:space="preserve">Phần tử lệch quá 1e-04</w:t>
+            </w:r>
+          </w:p>
+        </w:tc>
+        <w:tc>
+          <w:tcPr>
+            <w:tcW w:type="dxa" w:w="2400"/>
+            <w:tcMar>
+              <w:top w:type="dxa" w:w="70"/>
+              <w:left w:type="dxa" w:w="110"/>
+              <w:bottom w:type="dxa" w:w="70"/>
+              <w:right w:type="dxa" w:w="110"/>
+            </w:tcMar>
+          </w:tcPr>
+          <w:p>
+            <w:pPr>
+              <w:spacing w:after="0"/>
+            </w:pPr>
+            <w:r>
+              <w:rPr>
+                <w:rFonts w:ascii="Calibri" w:cs="Calibri" w:eastAsia="Calibri" w:hAnsi="Calibri"/>
+                <w:color w:val="1A2733"/>
+                <w:sz w:val="19"/>
+                <w:szCs w:val="19"/>
+              </w:rPr>
+              <w:t xml:space="preserve">199 / 100.000</w:t>
+            </w:r>
+          </w:p>
+        </w:tc>
+        <w:tc>
+          <w:tcPr>
+            <w:tcW w:type="dxa" w:w="2826"/>
+            <w:tcMar>
+              <w:top w:type="dxa" w:w="70"/>
+              <w:left w:type="dxa" w:w="110"/>
+              <w:bottom w:type="dxa" w:w="70"/>
+              <w:right w:type="dxa" w:w="110"/>
+            </w:tcMar>
+          </w:tcPr>
+          <w:p>
+            <w:pPr>
+              <w:spacing w:after="0"/>
+            </w:pPr>
+            <w:r>
+              <w:rPr>
+                <w:rFonts w:ascii="Calibri" w:cs="Calibri" w:eastAsia="Calibri" w:hAnsi="Calibri"/>
+                <w:color w:val="1A2733"/>
+                <w:sz w:val="19"/>
+                <w:szCs w:val="19"/>
+              </w:rPr>
+              <w:t xml:space="preserve">Chỉ 0,199%, là đuôi phân phối</w:t>
+            </w:r>
+          </w:p>
+        </w:tc>
+      </w:tr>
+      <w:tr>
+        <w:tc>
+          <w:tcPr>
+            <w:tcW w:type="dxa" w:w="3800"/>
+            <w:shd w:fill="F4F8FA" w:val="clear"/>
+            <w:tcMar>
+              <w:top w:type="dxa" w:w="70"/>
+              <w:left w:type="dxa" w:w="110"/>
+              <w:bottom w:type="dxa" w:w="70"/>
+              <w:right w:type="dxa" w:w="110"/>
+            </w:tcMar>
+          </w:tcPr>
+          <w:p>
+            <w:pPr>
+              <w:spacing w:after="0"/>
+            </w:pPr>
+            <w:r>
+              <w:rPr>
+                <w:rFonts w:ascii="Calibri" w:cs="Calibri" w:eastAsia="Calibri" w:hAnsi="Calibri"/>
+                <w:b/>
+                <w:bCs/>
+                <w:color w:val="1A2733"/>
+                <w:sz w:val="19"/>
+                <w:szCs w:val="19"/>
+              </w:rPr>
+              <w:t xml:space="preserve">Ảnh dự đoán khác nhau</w:t>
+            </w:r>
+          </w:p>
+        </w:tc>
+        <w:tc>
+          <w:tcPr>
+            <w:tcW w:type="dxa" w:w="2400"/>
+            <w:shd w:fill="F4F8FA" w:val="clear"/>
+            <w:tcMar>
+              <w:top w:type="dxa" w:w="70"/>
+              <w:left w:type="dxa" w:w="110"/>
+              <w:bottom w:type="dxa" w:w="70"/>
+              <w:right w:type="dxa" w:w="110"/>
+            </w:tcMar>
+          </w:tcPr>
+          <w:p>
+            <w:pPr>
+              <w:spacing w:after="0"/>
+            </w:pPr>
+            <w:r>
+              <w:rPr>
+                <w:rFonts w:ascii="Calibri" w:cs="Calibri" w:eastAsia="Calibri" w:hAnsi="Calibri"/>
+                <w:color w:val="1A2733"/>
+                <w:sz w:val="19"/>
+                <w:szCs w:val="19"/>
+              </w:rPr>
+              <w:t xml:space="preserve">0 / 10.000</w:t>
+            </w:r>
+          </w:p>
+        </w:tc>
+        <w:tc>
+          <w:tcPr>
+            <w:tcW w:type="dxa" w:w="2826"/>
+            <w:shd w:fill="F4F8FA" w:val="clear"/>
+            <w:tcMar>
+              <w:top w:type="dxa" w:w="70"/>
+              <w:left w:type="dxa" w:w="110"/>
+              <w:bottom w:type="dxa" w:w="70"/>
+              <w:right w:type="dxa" w:w="110"/>
+            </w:tcMar>
+          </w:tcPr>
+          <w:p>
+            <w:pPr>
+              <w:spacing w:after="0"/>
+            </w:pPr>
+            <w:r>
+              <w:rPr>
+                <w:rFonts w:ascii="Calibri" w:cs="Calibri" w:eastAsia="Calibri" w:hAnsi="Calibri"/>
+                <w:color w:val="1A2733"/>
+                <w:sz w:val="19"/>
+                <w:szCs w:val="19"/>
+              </w:rPr>
+              <w:t xml:space="preserve">Không một ảnh nào đổi kết quả</w:t>
+            </w:r>
+          </w:p>
+        </w:tc>
+      </w:tr>
+    </w:tbl>
+    <w:p>
+      <w:pPr>
+        <w:spacing w:after="120" w:before="0"/>
+      </w:pPr>
+      <w:r>
+        <w:rPr>
+          <w:rFonts w:ascii="Calibri" w:cs="Calibri" w:eastAsia="Calibri" w:hAnsi="Calibri"/>
+          <w:b/>
+          <w:bCs/>
+          <w:color w:val="1A2733"/>
+          <w:sz w:val="22"/>
+          <w:szCs w:val="22"/>
+        </w:rPr>
+        <w:t xml:space="preserve">Vì sao không gọi là "giống hệt từng bit". </w:t>
+      </w:r>
+      <w:r>
+        <w:rPr>
+          <w:rFonts w:ascii="Calibri" w:cs="Calibri" w:eastAsia="Calibri" w:hAnsi="Calibri"/>
+          <w:color w:val="1A2733"/>
+          <w:sz w:val="22"/>
+          <w:szCs w:val="22"/>
+        </w:rPr>
+        <w:t xml:space="preserve">Hai cách tương đương về mặt toán học, nhưng PyTorch chạy Linear bằng phép nhân ma trận còn Conv2d qua im2col. Cộng dồn 144 số hạng theo hai thứ tự khác nhau thì float32 làm tròn khác nhau — 30 lần eps là đúng mức dự kiến, không phải lỗi công thức. Chữ "bit-exact" để dành cho hai chỗ thật sự giống nhau từng bit: bỏ softmax và đổi thứ tự relu ↔ maxpool.</w:t>
+      </w:r>
+    </w:p>
+    <w:p>
+      <w:pPr>
+        <w:spacing w:after="120" w:before="0"/>
+      </w:pPr>
+      <w:r>
+        <w:rPr>
+          <w:rFonts w:ascii="Calibri" w:cs="Calibri" w:eastAsia="Calibri" w:hAnsi="Calibri"/>
+          <w:b/>
+          <w:bCs/>
+          <w:color w:val="1A2733"/>
+          <w:sz w:val="22"/>
+          <w:szCs w:val="22"/>
+        </w:rPr>
+        <w:t xml:space="preserve">Hệ quả cho Phase 2D — đáng giá hơn cả mục này. </w:t>
+      </w:r>
+      <w:r>
+        <w:rPr>
+          <w:rFonts w:ascii="Calibri" w:cs="Calibri" w:eastAsia="Calibri" w:hAnsi="Calibri"/>
+          <w:color w:val="1A2733"/>
+          <w:sz w:val="22"/>
+          <w:szCs w:val="22"/>
+        </w:rPr>
+        <w:t xml:space="preserve">Roadmap trước đây đặt ngưỡng verify golden model C là sai số tuyệt đối dưới 1e-04. Số đo trên cho thấy chính PyTorch chạy cùng một phép toán bằng hai cách đã vượt ngưỡng đó. Nghĩa là ngưỡng tuyệt đối không đạt được kể cả khi code C viết đúng hoàn toàn, và sẽ làm mất nhiều ngày đi tìm một bug không tồn tại. Tiêu chí đã sửa trong roadmap: sai số tương đối dưới khoảng 1e-05 theo từng lớp, và số ảnh dự đoán khác nhau trên 10.000 ảnh test phải bằng 0.</w:t>
+      </w:r>
+    </w:p>
+    <w:p>
+      <w:pPr>
+        <w:spacing w:after="220" w:before="0"/>
+      </w:pPr>
+      <w:r>
+        <w:rPr>
+          <w:rFonts w:ascii="Calibri" w:cs="Calibri" w:eastAsia="Calibri" w:hAnsi="Calibri"/>
+          <w:b/>
+          <w:bCs/>
+          <w:color w:val="1C7293"/>
+          <w:sz w:val="22"/>
+          <w:szCs w:val="22"/>
+        </w:rPr>
+        <w:t xml:space="preserve">→ Chọn: </w:t>
+      </w:r>
+      <w:r>
+        <w:rPr>
+          <w:rFonts w:ascii="Calibri" w:cs="Calibri" w:eastAsia="Calibri" w:hAnsi="Calibri"/>
+          <w:color w:val="1A2733"/>
+          <w:sz w:val="22"/>
+          <w:szCs w:val="22"/>
+        </w:rPr>
+        <w:t xml:space="preserve">Giữ Linear. Không tiết kiệm được tham số hay phép tính nào — cả hai đều 1.450 params và 1.440 MAC — trong khi golden model C sẽ phải viết 6 vòng lặp thay vì 2, tức nhiều chỗ sai hơn cho cùng một kết quả. Phương án Conv2d chỉ có giá trị ở giai đoạn thiết kế RTL của project sau: nếu muốn một khối phần cứng duy nhất xử lý được cả conv lẫn fc thay vì hai khối riêng, biểu diễn fc dưới dạng conv sẽ tiết kiệm diện tích chip. Đó là quyết định về kiến trúc phần cứng, không đòi hỏi sửa model PyTorch.</w:t>
+      </w:r>
+    </w:p>
+    <w:p>
+      <w:pPr>
+        <w:pStyle w:val="Heading1"/>
+      </w:pPr>
+      <w:r>
+        <w:t xml:space="preserve">13. Tổng hợp lựa chọn</w:t>
       </w:r>
     </w:p>
     <w:p>
@@ -6865,7 +8478,7 @@
                 <w:sz w:val="19"/>
                 <w:szCs w:val="19"/>
               </w:rPr>
-              <w:t xml:space="preserve">Pooling</w:t>
+              <w:t xml:space="preserve">Biểu diễn lớp fc</w:t>
             </w:r>
           </w:p>
         </w:tc>
@@ -6891,7 +8504,7 @@
                 <w:sz w:val="19"/>
                 <w:szCs w:val="19"/>
               </w:rPr>
-              <w:t xml:space="preserve">Max 2×2</w:t>
+              <w:t xml:space="preserve">Linear(144, 10)</w:t>
             </w:r>
           </w:p>
         </w:tc>
@@ -6917,7 +8530,7 @@
                 <w:sz w:val="19"/>
                 <w:szCs w:val="19"/>
               </w:rPr>
-              <w:t xml:space="preserve">Chỉ cần comparator</w:t>
+              <w:t xml:space="preserve">Tương đương Conv2d(16→10, k3, p0); giữ Linear vì C chỉ cần 2 vòng lặp</w:t>
             </w:r>
           </w:p>
         </w:tc>
@@ -6946,7 +8559,7 @@
                 <w:sz w:val="19"/>
                 <w:szCs w:val="19"/>
               </w:rPr>
-              <w:t xml:space="preserve">Kích hoạt</w:t>
+              <w:t xml:space="preserve">Pooling</w:t>
             </w:r>
           </w:p>
         </w:tc>
@@ -6971,7 +8584,7 @@
                 <w:sz w:val="19"/>
                 <w:szCs w:val="19"/>
               </w:rPr>
-              <w:t xml:space="preserve">ReLU</w:t>
+              <w:t xml:space="preserve">Max 2×2</w:t>
             </w:r>
           </w:p>
         </w:tc>
@@ -6996,7 +8609,7 @@
                 <w:sz w:val="19"/>
                 <w:szCs w:val="19"/>
               </w:rPr>
-              <w:t xml:space="preserve">1 comparator + 1 mux</w:t>
+              <w:t xml:space="preserve">Chỉ cần comparator</w:t>
             </w:r>
           </w:p>
         </w:tc>
@@ -7026,7 +8639,7 @@
                 <w:sz w:val="19"/>
                 <w:szCs w:val="19"/>
               </w:rPr>
-              <w:t xml:space="preserve">Loss</w:t>
+              <w:t xml:space="preserve">Kích hoạt</w:t>
             </w:r>
           </w:p>
         </w:tc>
@@ -7052,7 +8665,7 @@
                 <w:sz w:val="19"/>
                 <w:szCs w:val="19"/>
               </w:rPr>
-              <w:t xml:space="preserve">CrossEntropyLoss</w:t>
+              <w:t xml:space="preserve">ReLU</w:t>
             </w:r>
           </w:p>
         </w:tc>
@@ -7078,7 +8691,7 @@
                 <w:sz w:val="19"/>
                 <w:szCs w:val="19"/>
               </w:rPr>
-              <w:t xml:space="preserve">Chuẩn cho phân loại nhiều lớp; bỏ được softmax khi inference</w:t>
+              <w:t xml:space="preserve">1 comparator + 1 mux</w:t>
             </w:r>
           </w:p>
         </w:tc>
@@ -7107,7 +8720,7 @@
                 <w:sz w:val="19"/>
                 <w:szCs w:val="19"/>
               </w:rPr>
-              <w:t xml:space="preserve">Optimizer</w:t>
+              <w:t xml:space="preserve">Loss</w:t>
             </w:r>
           </w:p>
         </w:tc>
@@ -7132,7 +8745,7 @@
                 <w:sz w:val="19"/>
                 <w:szCs w:val="19"/>
               </w:rPr>
-              <w:t xml:space="preserve">Adam, lr 0,001</w:t>
+              <w:t xml:space="preserve">CrossEntropyLoss</w:t>
             </w:r>
           </w:p>
         </w:tc>
@@ -7157,7 +8770,7 @@
                 <w:sz w:val="19"/>
                 <w:szCs w:val="19"/>
               </w:rPr>
-              <w:t xml:space="preserve">Ít phải chỉnh tay, không ảnh hưởng phần cứng</w:t>
+              <w:t xml:space="preserve">Chuẩn cho phân loại nhiều lớp; bỏ được softmax khi inference</w:t>
             </w:r>
           </w:p>
         </w:tc>
@@ -7187,7 +8800,7 @@
                 <w:sz w:val="19"/>
                 <w:szCs w:val="19"/>
               </w:rPr>
-              <w:t xml:space="preserve">Chống overfit</w:t>
+              <w:t xml:space="preserve">Optimizer</w:t>
             </w:r>
           </w:p>
         </w:tc>
@@ -7213,7 +8826,7 @@
                 <w:sz w:val="19"/>
                 <w:szCs w:val="19"/>
               </w:rPr>
-              <w:t xml:space="preserve">Early stopping theo val acc</w:t>
+              <w:t xml:space="preserve">Adam, lr 0,001</w:t>
             </w:r>
           </w:p>
         </w:tc>
@@ -7239,7 +8852,7 @@
                 <w:sz w:val="19"/>
                 <w:szCs w:val="19"/>
               </w:rPr>
-              <w:t xml:space="preserve">Model nhỏ nên không cần Dropout</w:t>
+              <w:t xml:space="preserve">Ít phải chỉnh tay, không ảnh hưởng phần cứng</w:t>
             </w:r>
           </w:p>
         </w:tc>
@@ -7268,7 +8881,7 @@
                 <w:sz w:val="19"/>
                 <w:szCs w:val="19"/>
               </w:rPr>
-              <w:t xml:space="preserve">Chia dữ liệu</w:t>
+              <w:t xml:space="preserve">Chống overfit</w:t>
             </w:r>
           </w:p>
         </w:tc>
@@ -7293,7 +8906,7 @@
                 <w:sz w:val="19"/>
                 <w:szCs w:val="19"/>
               </w:rPr>
-              <w:t xml:space="preserve">50k / 10k / 10k, seed 42</w:t>
+              <w:t xml:space="preserve">Early stopping theo val acc</w:t>
             </w:r>
           </w:p>
         </w:tc>
@@ -7318,7 +8931,7 @@
                 <w:sz w:val="19"/>
                 <w:szCs w:val="19"/>
               </w:rPr>
-              <w:t xml:space="preserve">Test set chạm đúng 1 lần</w:t>
+              <w:t xml:space="preserve">Model nhỏ nên không cần Dropout</w:t>
             </w:r>
           </w:p>
         </w:tc>
@@ -7348,7 +8961,7 @@
                 <w:sz w:val="19"/>
                 <w:szCs w:val="19"/>
               </w:rPr>
-              <w:t xml:space="preserve">Thu nhỏ</w:t>
+              <w:t xml:space="preserve">Chia dữ liệu</w:t>
             </w:r>
           </w:p>
         </w:tc>
@@ -7374,7 +8987,7 @@
                 <w:sz w:val="19"/>
                 <w:szCs w:val="19"/>
               </w:rPr>
-              <w:t xml:space="preserve">Sửa kiến trúc, quantization sau</w:t>
+              <w:t xml:space="preserve">50k / 10k / 10k, seed 42</w:t>
             </w:r>
           </w:p>
         </w:tc>
@@ -7400,7 +9013,7 @@
                 <w:sz w:val="19"/>
                 <w:szCs w:val="19"/>
               </w:rPr>
-              <w:t xml:space="preserve">Hai cơ chế khác nhau, cộng dồn được</w:t>
+              <w:t xml:space="preserve">Test set chạm đúng 1 lần</w:t>
             </w:r>
           </w:p>
         </w:tc>
@@ -7429,7 +9042,7 @@
                 <w:sz w:val="19"/>
                 <w:szCs w:val="19"/>
               </w:rPr>
-              <w:t xml:space="preserve">Framework</w:t>
+              <w:t xml:space="preserve">Thu nhỏ</w:t>
             </w:r>
           </w:p>
         </w:tc>
@@ -7454,7 +9067,7 @@
                 <w:sz w:val="19"/>
                 <w:szCs w:val="19"/>
               </w:rPr>
-              <w:t xml:space="preserve">PyTorch</w:t>
+              <w:t xml:space="preserve">Sửa kiến trúc, quantization sau</w:t>
             </w:r>
           </w:p>
         </w:tc>
@@ -7479,7 +9092,7 @@
                 <w:sz w:val="19"/>
                 <w:szCs w:val="19"/>
               </w:rPr>
-              <w:t xml:space="preserve">Giữ nguyên hiểu biết đã có</w:t>
+              <w:t xml:space="preserve">Hai cơ chế khác nhau, cộng dồn được</w:t>
             </w:r>
           </w:p>
         </w:tc>
@@ -7509,6 +9122,87 @@
                 <w:sz w:val="19"/>
                 <w:szCs w:val="19"/>
               </w:rPr>
+              <w:t xml:space="preserve">Framework</w:t>
+            </w:r>
+          </w:p>
+        </w:tc>
+        <w:tc>
+          <w:tcPr>
+            <w:tcW w:type="dxa" w:w="3500"/>
+            <w:shd w:fill="F4F8FA" w:val="clear"/>
+            <w:tcMar>
+              <w:top w:type="dxa" w:w="70"/>
+              <w:left w:type="dxa" w:w="110"/>
+              <w:bottom w:type="dxa" w:w="70"/>
+              <w:right w:type="dxa" w:w="110"/>
+            </w:tcMar>
+          </w:tcPr>
+          <w:p>
+            <w:pPr>
+              <w:spacing w:after="0"/>
+            </w:pPr>
+            <w:r>
+              <w:rPr>
+                <w:rFonts w:ascii="Calibri" w:cs="Calibri" w:eastAsia="Calibri" w:hAnsi="Calibri"/>
+                <w:color w:val="1A2733"/>
+                <w:sz w:val="19"/>
+                <w:szCs w:val="19"/>
+              </w:rPr>
+              <w:t xml:space="preserve">PyTorch</w:t>
+            </w:r>
+          </w:p>
+        </w:tc>
+        <w:tc>
+          <w:tcPr>
+            <w:tcW w:type="dxa" w:w="3526"/>
+            <w:shd w:fill="F4F8FA" w:val="clear"/>
+            <w:tcMar>
+              <w:top w:type="dxa" w:w="70"/>
+              <w:left w:type="dxa" w:w="110"/>
+              <w:bottom w:type="dxa" w:w="70"/>
+              <w:right w:type="dxa" w:w="110"/>
+            </w:tcMar>
+          </w:tcPr>
+          <w:p>
+            <w:pPr>
+              <w:spacing w:after="0"/>
+            </w:pPr>
+            <w:r>
+              <w:rPr>
+                <w:rFonts w:ascii="Calibri" w:cs="Calibri" w:eastAsia="Calibri" w:hAnsi="Calibri"/>
+                <w:color w:val="1A2733"/>
+                <w:sz w:val="19"/>
+                <w:szCs w:val="19"/>
+              </w:rPr>
+              <w:t xml:space="preserve">Giữ nguyên hiểu biết đã có</w:t>
+            </w:r>
+          </w:p>
+        </w:tc>
+      </w:tr>
+      <w:tr>
+        <w:tc>
+          <w:tcPr>
+            <w:tcW w:type="dxa" w:w="2000"/>
+            <w:tcMar>
+              <w:top w:type="dxa" w:w="70"/>
+              <w:left w:type="dxa" w:w="110"/>
+              <w:bottom w:type="dxa" w:w="70"/>
+              <w:right w:type="dxa" w:w="110"/>
+            </w:tcMar>
+          </w:tcPr>
+          <w:p>
+            <w:pPr>
+              <w:spacing w:after="0"/>
+            </w:pPr>
+            <w:r>
+              <w:rPr>
+                <w:rFonts w:ascii="Calibri" w:cs="Calibri" w:eastAsia="Calibri" w:hAnsi="Calibri"/>
+                <w:b/>
+                <w:bCs/>
+                <w:color w:val="1A2733"/>
+                <w:sz w:val="19"/>
+                <w:szCs w:val="19"/>
+              </w:rPr>
               <w:t xml:space="preserve">Xuống phần cứng</w:t>
             </w:r>
           </w:p>
@@ -7516,7 +9210,6 @@
         <w:tc>
           <w:tcPr>
             <w:tcW w:type="dxa" w:w="3500"/>
-            <w:shd w:fill="F4F8FA" w:val="clear"/>
             <w:tcMar>
               <w:top w:type="dxa" w:w="70"/>
               <w:left w:type="dxa" w:w="110"/>
@@ -7542,7 +9235,6 @@
         <w:tc>
           <w:tcPr>
             <w:tcW w:type="dxa" w:w="3526"/>
-            <w:shd w:fill="F4F8FA" w:val="clear"/>
             <w:tcMar>
               <w:top w:type="dxa" w:w="70"/>
               <w:left w:type="dxa" w:w="110"/>

</xml_diff>